<commit_message>
docs: add project SPMP, SRS, and synopsis documents
</commit_message>
<xml_diff>
--- a/docs/TradeSage_AI_SPMP.docx
+++ b/docs/TradeSage_AI_SPMP.docx
@@ -35,21 +35,6 @@
     </w:p>
     <w:p>
       <w:pPr>
-        <w:spacing w:after="120" w:line="276"/>
-      </w:pPr>
-      <w:r>
-        <w:rPr>
-          <w:rFonts w:ascii="Arial" w:cs="Arial" w:eastAsia="Arial" w:hAnsi="Arial"/>
-          <w:i/>
-          <w:iCs/>
-          <w:sz w:val="22"/>
-          <w:szCs w:val="22"/>
-        </w:rPr>
-        <w:t xml:space="preserve">CE363: Project-III | CHARUSAT</w:t>
-      </w:r>
-    </w:p>
-    <w:p>
-      <w:pPr>
         <w:pStyle w:val="Heading1"/>
         <w:pBdr>
           <w:bottom w:val="single" w:color="1F4E79" w:sz="6" w:space="2"/>
@@ -95,7 +80,7 @@
           <w:sz w:val="22"/>
           <w:szCs w:val="22"/>
         </w:rPr>
-        <w:t xml:space="preserve">This document defines the management approach for TradeSage AI: schedule, effort allocation, risk register, and monitoring plan across the project's 60 allotted lab hours (CE363, solo development).</w:t>
+        <w:t xml:space="preserve">This document defines the management approach for TradeSage AI: schedule, effort allocation, risk register.</w:t>
       </w:r>
     </w:p>
     <w:p>
@@ -2367,7 +2352,7 @@
           <w:sz w:val="22"/>
           <w:szCs w:val="22"/>
         </w:rPr>
-        <w:t xml:space="preserve">Coding Standard (CHARUSAT v1.0) compliance checked at each module completion, not deferred to a final cleanup pass</w:t>
+        <w:t xml:space="preserve">Coding Standard compliance checked at each module completion, not deferred to a final cleanup pass</w:t>
       </w:r>
     </w:p>
     <w:p>
@@ -2400,7 +2385,7 @@
           <w:sz w:val="22"/>
           <w:szCs w:val="22"/>
         </w:rPr>
-        <w:t xml:space="preserve">All code follows the CHARUSAT Coding Standard v1.0 (naming conventions, module headers). Every module includes a header documenting name, date, author, modification history, synopsis, and functions/I-O params, per course requirement.</w:t>
+        <w:t xml:space="preserve">All code follows the CHARUSAT Coding Standard (naming conventions, module headers). Every module includes a header documenting name, date, author, modification history, synopsis, and functions/I-O params, per course requirement.</w:t>
       </w:r>
     </w:p>
     <w:sectPr>
@@ -2456,7 +2441,7 @@
 </file>
 
 <file path=word/footer1.xml><?xml version="1.0" encoding="utf-8"?>
-<w:ftr xmlns:wpc="http://schemas.microsoft.com/office/word/2010/wordprocessingCanvas" xmlns:mc="http://schemas.openxmlformats.org/markup-compatibility/2006" xmlns:o="urn:schemas-microsoft-com:office:office" xmlns:r="http://schemas.openxmlformats.org/officeDocument/2006/relationships" xmlns:m="http://schemas.openxmlformats.org/officeDocument/2006/math" xmlns:v="urn:schemas-microsoft-com:vml" xmlns:wp14="http://schemas.microsoft.com/office/word/2010/wordprocessingDrawing" xmlns:wp="http://schemas.openxmlformats.org/drawingml/2006/wordprocessingDrawing" xmlns:w10="urn:schemas-microsoft-com:office:word" xmlns:w="http://schemas.openxmlformats.org/wordprocessingml/2006/main" xmlns:w14="http://schemas.microsoft.com/office/word/2010/wordml" xmlns:w15="http://schemas.microsoft.com/office/word/2012/wordml" xmlns:wpg="http://schemas.microsoft.com/office/word/2010/wordprocessingGroup" xmlns:wpi="http://schemas.microsoft.com/office/word/2010/wordprocessingInk" xmlns:wne="http://schemas.microsoft.com/office/word/2006/wordml" xmlns:wps="http://schemas.microsoft.com/office/word/2010/wordprocessingShape">
+<w:ftr xmlns:w="http://schemas.openxmlformats.org/wordprocessingml/2006/main" xmlns:r="http://schemas.openxmlformats.org/officeDocument/2006/relationships" xmlns:v="urn:schemas-microsoft-com:vml" xmlns:o="urn:schemas-microsoft-com:office:office" xmlns:w10="urn:schemas-microsoft-com:office:word">
   <w:p>
     <w:pPr>
       <w:jc w:val="center"/>
@@ -2468,18 +2453,21 @@
         <w:sz w:val="16"/>
         <w:szCs w:val="16"/>
       </w:rPr>
-      <w:t xml:space="preserve">TradeSage AI SPMP | CE363 Project-III | Decision-support tool, not financial advice | Page </w:t>
+      <w:t xml:space="preserve">TradeSage AI SPMP | Decision-support tool, not financial advice | Page </w:t>
     </w:r>
     <w:r>
-      <w:rPr>
-        <w:rFonts w:ascii="Arial" w:cs="Arial" w:eastAsia="Arial" w:hAnsi="Arial"/>
-        <w:color w:val="666666"/>
-        <w:sz w:val="16"/>
-        <w:szCs w:val="16"/>
-      </w:rPr>
       <w:fldChar w:fldCharType="begin"/>
-      <w:instrText xml:space="preserve">PAGE</w:instrText>
+    </w:r>
+    <w:r>
+      <w:instrText xml:space="preserve"> PAGE </w:instrText>
+    </w:r>
+    <w:r>
       <w:fldChar w:fldCharType="separate"/>
+    </w:r>
+    <w:r>
+      <w:t>1</w:t>
+    </w:r>
+    <w:r>
       <w:fldChar w:fldCharType="end"/>
     </w:r>
   </w:p>

</xml_diff>